<commit_message>
docs(一审论文): split 3.4.6 into 3.4.6 系统安全 + 3.4.7 数据集来源
Split the combined "3.4.6 系统安全与数据设计" section. Keep the security
content (JWT auth, bcrypt password hashing, FastAPI role authorization)
under "3.4.6 系统安全" with a cleaned intro. Replace the outdated random
synthetic-data description with a new "3.4.7 数据集来源" subsection that
documents the real Amazon Reviews 2023 (Health & Personal Care) dataset,
the asymmetric k-core sampling and per-user time rebasing, and the
resulting dataset (11 categories, 624 products, 853 consumers, 5026
reviews, 12242 behaviors, 783 orders).

Co-Authored-By: Claude Opus 4.8 <noreply@anthropic.com>
</commit_message>
<xml_diff>
--- a/220512321-张煜坤-个性化在线购物广告推荐系统开发与设计（一审论文）.docx
+++ b/220512321-张煜坤-个性化在线购物广告推荐系统开发与设计（一审论文）.docx
@@ -21498,7 +21498,7 @@
           <w:color w:val="000000"/>
           <w:lang w:eastAsia="zh-CN"/>
         </w:rPr>
-        <w:t>3.</w:t>
+        <w:t>3.4.6 系统安全</w:t>
       </w:r>
       <w:r>
         <w:rPr>
@@ -21506,7 +21506,6 @@
           <w:color w:val="000000"/>
           <w:lang w:eastAsia="zh-CN"/>
         </w:rPr>
-        <w:t>4.6</w:t>
       </w:r>
       <w:r>
         <w:rPr>
@@ -21514,7 +21513,6 @@
           <w:color w:val="000000"/>
           <w:lang w:eastAsia="zh-CN"/>
         </w:rPr>
-        <w:t xml:space="preserve"> </w:t>
       </w:r>
       <w:r>
         <w:rPr>
@@ -21522,7 +21520,6 @@
           <w:color w:val="000000"/>
           <w:lang w:eastAsia="zh-CN"/>
         </w:rPr>
-        <w:t>系统安全</w:t>
       </w:r>
       <w:r>
         <w:rPr>
@@ -21530,7 +21527,6 @@
           <w:color w:val="000000"/>
           <w:lang w:eastAsia="zh-CN"/>
         </w:rPr>
-        <w:t>与数据</w:t>
       </w:r>
       <w:r>
         <w:rPr>
@@ -21538,7 +21534,6 @@
           <w:color w:val="000000"/>
           <w:lang w:eastAsia="zh-CN"/>
         </w:rPr>
-        <w:t>设计</w:t>
       </w:r>
       <w:bookmarkEnd w:id="63"/>
     </w:p>
@@ -21553,13 +21548,12 @@
         <w:rPr>
           <w:lang w:eastAsia="zh-CN"/>
         </w:rPr>
-        <w:t>系统安全设计包括认证、授权、数据保护这三个方面安全设计，认证、授权、数据保护这三个方面的系统安全设计都在内</w:t>
-      </w:r>
-      <w:r>
-        <w:rPr>
-          <w:lang w:eastAsia="zh-CN"/>
-        </w:rPr>
-        <w:t>：</w:t>
+        <w:t>系统安全设计涵盖身份认证、密码安全与角色授权三个方面，分别从访问主体的身份核验、敏感数据的存储保护和接口权限的精细管控三个层面保障系统的安全性，具体设计如下：</w:t>
+      </w:r>
+      <w:r>
+        <w:rPr>
+          <w:lang w:eastAsia="zh-CN"/>
+        </w:rPr>
       </w:r>
     </w:p>
     <w:p>
@@ -21912,6 +21906,7 @@
     </w:p>
     <w:p>
       <w:pPr>
+        <w:pStyle w:val="31"/>
         <w:ind w:firstLineChars="200" w:firstLine="480"/>
         <w:rPr>
           <w:lang w:eastAsia="zh-CN"/>
@@ -21921,146 +21916,122 @@
         <w:rPr>
           <w:lang w:eastAsia="zh-CN"/>
         </w:rPr>
-        <w:lastRenderedPageBreak/>
-        <w:t>为了检验系统的功能以及展示推荐的效果，系统提供了种子数据生成脚本，可以自动生成接近真实的模拟数据。创建</w:t>
-      </w:r>
-      <w:r>
-        <w:rPr>
-          <w:lang w:eastAsia="zh-CN"/>
-        </w:rPr>
-        <w:t>100</w:t>
-      </w:r>
-      <w:r>
-        <w:rPr>
-          <w:lang w:eastAsia="zh-CN"/>
-        </w:rPr>
-        <w:t>个用户，其中包括一名管理员、十个商家和</w:t>
-      </w:r>
-      <w:r>
-        <w:rPr>
-          <w:lang w:eastAsia="zh-CN"/>
-        </w:rPr>
-        <w:t>89</w:t>
-      </w:r>
-      <w:r>
-        <w:rPr>
-          <w:lang w:eastAsia="zh-CN"/>
-        </w:rPr>
-        <w:t>个消费者，消费者的活跃度评分随机分布于</w:t>
-      </w:r>
-      <w:r>
-        <w:rPr>
-          <w:lang w:eastAsia="zh-CN"/>
-        </w:rPr>
-        <w:t>0</w:t>
-      </w:r>
-      <w:r>
-        <w:rPr>
-          <w:lang w:eastAsia="zh-CN"/>
-        </w:rPr>
-        <w:t>到</w:t>
-      </w:r>
-      <w:r>
-        <w:rPr>
-          <w:lang w:eastAsia="zh-CN"/>
-        </w:rPr>
-        <w:t>100</w:t>
-      </w:r>
-      <w:r>
-        <w:rPr>
-          <w:lang w:eastAsia="zh-CN"/>
-        </w:rPr>
-        <w:t>之间，以体现真实用户的活跃度分布。商品数据用</w:t>
-      </w:r>
-      <w:r>
-        <w:rPr>
-          <w:lang w:eastAsia="zh-CN"/>
-        </w:rPr>
-        <w:t>10</w:t>
-      </w:r>
-      <w:r>
-        <w:rPr>
-          <w:lang w:eastAsia="zh-CN"/>
-        </w:rPr>
-        <w:t>个品类、</w:t>
-      </w:r>
-      <w:r>
-        <w:rPr>
-          <w:lang w:eastAsia="zh-CN"/>
-        </w:rPr>
-        <w:t>10</w:t>
-      </w:r>
-      <w:r>
-        <w:rPr>
-          <w:lang w:eastAsia="zh-CN"/>
-        </w:rPr>
-        <w:t>个修饰词、</w:t>
-      </w:r>
-      <w:r>
-        <w:rPr>
-          <w:lang w:eastAsia="zh-CN"/>
-        </w:rPr>
-        <w:t>10</w:t>
-      </w:r>
-      <w:r>
-        <w:rPr>
-          <w:lang w:eastAsia="zh-CN"/>
-        </w:rPr>
-        <w:t>个商品名组合成</w:t>
-      </w:r>
-      <w:r>
-        <w:rPr>
-          <w:lang w:eastAsia="zh-CN"/>
-        </w:rPr>
-        <w:t>1000</w:t>
-      </w:r>
-      <w:r>
-        <w:rPr>
-          <w:lang w:eastAsia="zh-CN"/>
-        </w:rPr>
-        <w:t>件中文商品，品类有电子产品、服装鞋帽、图书音像等</w:t>
-      </w:r>
-      <w:r>
-        <w:rPr>
-          <w:lang w:eastAsia="zh-CN"/>
-        </w:rPr>
-        <w:t>10</w:t>
-      </w:r>
-      <w:r>
-        <w:rPr>
-          <w:lang w:eastAsia="zh-CN"/>
-        </w:rPr>
-        <w:t>大类，价格随机分布在</w:t>
-      </w:r>
-      <w:r>
-        <w:rPr>
-          <w:lang w:eastAsia="zh-CN"/>
-        </w:rPr>
-        <w:t>9.9</w:t>
-      </w:r>
-      <w:r>
-        <w:rPr>
-          <w:lang w:eastAsia="zh-CN"/>
-        </w:rPr>
-        <w:t>元到</w:t>
-      </w:r>
-      <w:r>
-        <w:rPr>
-          <w:lang w:eastAsia="zh-CN"/>
-        </w:rPr>
-        <w:t>2999</w:t>
-      </w:r>
-      <w:r>
-        <w:rPr>
-          <w:lang w:eastAsia="zh-CN"/>
-        </w:rPr>
-        <w:t>元之间</w:t>
-      </w:r>
-      <w:r>
-        <w:rPr>
-          <w:lang w:eastAsia="zh-CN"/>
-        </w:rPr>
-        <w:t>。</w:t>
+        <w:t>3.4.7 数据集来源</w:t>
+      </w:r>
+      <w:r>
+        <w:rPr>
+          <w:lang w:eastAsia="zh-CN"/>
+        </w:rPr>
+      </w:r>
+      <w:r>
+        <w:rPr>
+          <w:lang w:eastAsia="zh-CN"/>
+        </w:rPr>
+      </w:r>
+      <w:r>
+        <w:rPr>
+          <w:lang w:eastAsia="zh-CN"/>
+        </w:rPr>
+      </w:r>
+      <w:r>
+        <w:rPr>
+          <w:lang w:eastAsia="zh-CN"/>
+        </w:rPr>
+      </w:r>
+      <w:r>
+        <w:rPr>
+          <w:lang w:eastAsia="zh-CN"/>
+        </w:rPr>
+      </w:r>
+      <w:r>
+        <w:rPr>
+          <w:lang w:eastAsia="zh-CN"/>
+        </w:rPr>
+      </w:r>
+      <w:r>
+        <w:rPr>
+          <w:lang w:eastAsia="zh-CN"/>
+        </w:rPr>
+      </w:r>
+      <w:r>
+        <w:rPr>
+          <w:lang w:eastAsia="zh-CN"/>
+        </w:rPr>
+      </w:r>
+      <w:r>
+        <w:rPr>
+          <w:lang w:eastAsia="zh-CN"/>
+        </w:rPr>
+      </w:r>
+      <w:r>
+        <w:rPr>
+          <w:lang w:eastAsia="zh-CN"/>
+        </w:rPr>
+      </w:r>
+      <w:r>
+        <w:rPr>
+          <w:lang w:eastAsia="zh-CN"/>
+        </w:rPr>
+      </w:r>
+      <w:r>
+        <w:rPr>
+          <w:lang w:eastAsia="zh-CN"/>
+        </w:rPr>
+      </w:r>
+      <w:r>
+        <w:rPr>
+          <w:lang w:eastAsia="zh-CN"/>
+        </w:rPr>
+      </w:r>
+      <w:r>
+        <w:rPr>
+          <w:lang w:eastAsia="zh-CN"/>
+        </w:rPr>
+      </w:r>
+      <w:r>
+        <w:rPr>
+          <w:lang w:eastAsia="zh-CN"/>
+        </w:rPr>
+      </w:r>
+      <w:r>
+        <w:rPr>
+          <w:lang w:eastAsia="zh-CN"/>
+        </w:rPr>
+      </w:r>
+      <w:r>
+        <w:rPr>
+          <w:lang w:eastAsia="zh-CN"/>
+        </w:rPr>
+      </w:r>
+      <w:r>
+        <w:rPr>
+          <w:lang w:eastAsia="zh-CN"/>
+        </w:rPr>
+      </w:r>
+      <w:r>
+        <w:rPr>
+          <w:lang w:eastAsia="zh-CN"/>
+        </w:rPr>
+      </w:r>
+      <w:r>
+        <w:rPr>
+          <w:lang w:eastAsia="zh-CN"/>
+        </w:rPr>
+      </w:r>
+      <w:r>
+        <w:rPr>
+          <w:lang w:eastAsia="zh-CN"/>
+        </w:rPr>
+      </w:r>
+      <w:r>
+        <w:rPr>
+          <w:lang w:eastAsia="zh-CN"/>
+        </w:rPr>
+      </w:r>
+      <w:r>
+        <w:rPr>
+          <w:lang w:eastAsia="zh-CN"/>
+        </w:rPr>
       </w:r>
     </w:p>
     <w:p>
@@ -22074,157 +22045,132 @@
         <w:rPr>
           <w:lang w:eastAsia="zh-CN"/>
         </w:rPr>
-        <w:t>行为数据有</w:t>
-      </w:r>
-      <w:r>
-        <w:rPr>
-          <w:lang w:eastAsia="zh-CN"/>
-        </w:rPr>
-        <w:t>12000</w:t>
-      </w:r>
-      <w:r>
-        <w:rPr>
-          <w:lang w:eastAsia="zh-CN"/>
-        </w:rPr>
-        <w:t>条，按照</w:t>
-      </w:r>
-      <w:r>
-        <w:rPr>
-          <w:lang w:eastAsia="zh-CN"/>
-        </w:rPr>
-        <w:t>40%</w:t>
-      </w:r>
-      <w:r>
-        <w:rPr>
-          <w:lang w:eastAsia="zh-CN"/>
-        </w:rPr>
-        <w:t>、</w:t>
-      </w:r>
-      <w:r>
-        <w:rPr>
-          <w:lang w:eastAsia="zh-CN"/>
-        </w:rPr>
-        <w:t>25%</w:t>
-      </w:r>
-      <w:r>
-        <w:rPr>
-          <w:lang w:eastAsia="zh-CN"/>
-        </w:rPr>
-        <w:t>、</w:t>
-      </w:r>
-      <w:r>
-        <w:rPr>
-          <w:lang w:eastAsia="zh-CN"/>
-        </w:rPr>
-        <w:t>15%</w:t>
-      </w:r>
-      <w:r>
-        <w:rPr>
-          <w:lang w:eastAsia="zh-CN"/>
-        </w:rPr>
-        <w:t>、</w:t>
-      </w:r>
-      <w:r>
-        <w:rPr>
-          <w:lang w:eastAsia="zh-CN"/>
-        </w:rPr>
-        <w:t>10%</w:t>
-      </w:r>
-      <w:r>
-        <w:rPr>
-          <w:lang w:eastAsia="zh-CN"/>
-        </w:rPr>
-        <w:t>、</w:t>
-      </w:r>
-      <w:r>
-        <w:rPr>
-          <w:lang w:eastAsia="zh-CN"/>
-        </w:rPr>
-        <w:t>10%</w:t>
-      </w:r>
-      <w:r>
-        <w:rPr>
-          <w:lang w:eastAsia="zh-CN"/>
-        </w:rPr>
-        <w:t>的比例分成浏览、点击、加购、购买、搜索这五个行为类别，历时大约为</w:t>
-      </w:r>
-      <w:r>
-        <w:rPr>
-          <w:lang w:eastAsia="zh-CN"/>
-        </w:rPr>
-        <w:t>30</w:t>
-      </w:r>
-      <w:r>
-        <w:rPr>
-          <w:lang w:eastAsia="zh-CN"/>
-        </w:rPr>
-        <w:t>天，可以再现真实的用户操作以及时间衰减的情况。社区数据有</w:t>
-      </w:r>
-      <w:r>
-        <w:rPr>
-          <w:lang w:eastAsia="zh-CN"/>
-        </w:rPr>
-        <w:t>600</w:t>
-      </w:r>
-      <w:r>
-        <w:rPr>
-          <w:lang w:eastAsia="zh-CN"/>
-        </w:rPr>
-        <w:t>条商品评价，分为</w:t>
-      </w:r>
-      <w:r>
-        <w:rPr>
-          <w:lang w:eastAsia="zh-CN"/>
-        </w:rPr>
-        <w:t>1</w:t>
-      </w:r>
-      <w:r>
-        <w:rPr>
-          <w:lang w:eastAsia="zh-CN"/>
-        </w:rPr>
-        <w:t>到</w:t>
-      </w:r>
-      <w:r>
-        <w:rPr>
-          <w:lang w:eastAsia="zh-CN"/>
-        </w:rPr>
-        <w:t>5</w:t>
-      </w:r>
-      <w:r>
-        <w:rPr>
-          <w:lang w:eastAsia="zh-CN"/>
-        </w:rPr>
-        <w:t>星级评价以及中文字的评价文本，同时又有</w:t>
-      </w:r>
-      <w:r>
-        <w:rPr>
-          <w:lang w:eastAsia="zh-CN"/>
-        </w:rPr>
-        <w:t>20</w:t>
-      </w:r>
-      <w:r>
-        <w:rPr>
-          <w:lang w:eastAsia="zh-CN"/>
-        </w:rPr>
-        <w:t>条广告，分别为英文标题和促销宣传语的组合，另外还有</w:t>
-      </w:r>
-      <w:r>
-        <w:rPr>
-          <w:lang w:eastAsia="zh-CN"/>
-        </w:rPr>
-        <w:t>350</w:t>
-      </w:r>
-      <w:r>
-        <w:rPr>
-          <w:lang w:eastAsia="zh-CN"/>
-        </w:rPr>
-        <w:t>份订单的记录</w:t>
-      </w:r>
-      <w:r>
-        <w:rPr>
-          <w:lang w:eastAsia="zh-CN"/>
-        </w:rPr>
-        <w:t>。</w:t>
+        <w:t>本系统的实验数据来源于公开数据集 Amazon Reviews 2023（McAuley Lab，美国加州大学圣地亚哥分校），并选取其中的 Health &amp; Personal Care（健康与个护）品类。该数据集提供真实的商品信息（标题、价格、所属分类、描述、店铺）、真实的用户、真实的 1—5 星评分与评论文本，以及带有真实时间戳的用户—商品交互记录，能够较为真实地反映在线购物场景下用户的行为与偏好。由于原始数据在用户侧高度稀疏（多数用户仅有一条评论），系统采用非对称 k-core 过滤进行采样：仅保留评论数不少于 5 的商品与交互次数不少于 3 的用户，并迭代收敛，以保证协同过滤所需的交互稠密度；同时按用户对评论时间线进行重定基，使其落入近期时间窗口，从而保留每位用户真实的行为节奏并支撑基于时间衰减的活跃度计算。</w:t>
+      </w:r>
+      <w:r>
+        <w:rPr>
+          <w:lang w:eastAsia="zh-CN"/>
+        </w:rPr>
+      </w:r>
+      <w:r>
+        <w:rPr>
+          <w:lang w:eastAsia="zh-CN"/>
+        </w:rPr>
+      </w:r>
+      <w:r>
+        <w:rPr>
+          <w:lang w:eastAsia="zh-CN"/>
+        </w:rPr>
+      </w:r>
+      <w:r>
+        <w:rPr>
+          <w:lang w:eastAsia="zh-CN"/>
+        </w:rPr>
+      </w:r>
+      <w:r>
+        <w:rPr>
+          <w:lang w:eastAsia="zh-CN"/>
+        </w:rPr>
+      </w:r>
+      <w:r>
+        <w:rPr>
+          <w:lang w:eastAsia="zh-CN"/>
+        </w:rPr>
+      </w:r>
+      <w:r>
+        <w:rPr>
+          <w:lang w:eastAsia="zh-CN"/>
+        </w:rPr>
+      </w:r>
+      <w:r>
+        <w:rPr>
+          <w:lang w:eastAsia="zh-CN"/>
+        </w:rPr>
+      </w:r>
+      <w:r>
+        <w:rPr>
+          <w:lang w:eastAsia="zh-CN"/>
+        </w:rPr>
+      </w:r>
+      <w:r>
+        <w:rPr>
+          <w:lang w:eastAsia="zh-CN"/>
+        </w:rPr>
+      </w:r>
+      <w:r>
+        <w:rPr>
+          <w:lang w:eastAsia="zh-CN"/>
+        </w:rPr>
+      </w:r>
+      <w:r>
+        <w:rPr>
+          <w:lang w:eastAsia="zh-CN"/>
+        </w:rPr>
+      </w:r>
+      <w:r>
+        <w:rPr>
+          <w:lang w:eastAsia="zh-CN"/>
+        </w:rPr>
+      </w:r>
+      <w:r>
+        <w:rPr>
+          <w:lang w:eastAsia="zh-CN"/>
+        </w:rPr>
+      </w:r>
+      <w:r>
+        <w:rPr>
+          <w:lang w:eastAsia="zh-CN"/>
+        </w:rPr>
+      </w:r>
+      <w:r>
+        <w:rPr>
+          <w:lang w:eastAsia="zh-CN"/>
+        </w:rPr>
+      </w:r>
+      <w:r>
+        <w:rPr>
+          <w:lang w:eastAsia="zh-CN"/>
+        </w:rPr>
+      </w:r>
+      <w:r>
+        <w:rPr>
+          <w:lang w:eastAsia="zh-CN"/>
+        </w:rPr>
+      </w:r>
+      <w:r>
+        <w:rPr>
+          <w:lang w:eastAsia="zh-CN"/>
+        </w:rPr>
+      </w:r>
+      <w:r>
+        <w:rPr>
+          <w:lang w:eastAsia="zh-CN"/>
+        </w:rPr>
+      </w:r>
+      <w:r>
+        <w:rPr>
+          <w:lang w:eastAsia="zh-CN"/>
+        </w:rPr>
+      </w:r>
+      <w:r>
+        <w:rPr>
+          <w:lang w:eastAsia="zh-CN"/>
+        </w:rPr>
+      </w:r>
+      <w:r>
+        <w:rPr>
+          <w:lang w:eastAsia="zh-CN"/>
+        </w:rPr>
+      </w:r>
+      <w:r>
+        <w:rPr>
+          <w:lang w:eastAsia="zh-CN"/>
+        </w:rPr>
+      </w:r>
+      <w:r>
+        <w:rPr>
+          <w:lang w:eastAsia="zh-CN"/>
+        </w:rPr>
       </w:r>
     </w:p>
     <w:p>
@@ -22240,7 +22186,7 @@
         <w:rPr>
           <w:lang w:eastAsia="zh-CN"/>
         </w:rPr>
-        <w:br w:type="page"/>
+        <w:t>经上述处理，最终构建的实验数据集包含 11 个商品分类、624 件商品、853 名消费者、5026 条真实评价、12242 条用户行为记录以及 783 笔订单；其中商品价格以数据集中的真实价格为准，少量缺失价格按同类商品价格的中位数补全。该数据集在保留真实性的同时规模适中，可完整支撑推荐引擎、用户活跃度评分与广告频控等模块的功能验证与效果演示。</w:t>
       </w:r>
     </w:p>
     <w:p>

</xml_diff>

<commit_message>
docs(一审论文): add 5.5 个性化推荐效果验证 with real metrics
Add a verification subsection (renumbering 测试结果汇总 to 5.6) that
backs the "effectively personalized per-user recommendation" claim with
measured results on the real dataset: pairwise Top-10 overlap 4.0%
(~96% user-specific) and leave-one-out Hit@10 12.9% / Hit@20 17.7% vs a
1.6% random baseline (~8x). Community review behavior is part of the
interaction matrix. Add backend/scripts/verify_personalization.py that
reproduces these numbers from the seeded DB.

Co-Authored-By: Claude Opus 4.8 <noreply@anthropic.com>
</commit_message>
<xml_diff>
--- a/220512321-张煜坤-个性化在线购物广告推荐系统开发与设计（一审论文）.docx
+++ b/220512321-张煜坤-个性化在线购物广告推荐系统开发与设计（一审论文）.docx
@@ -35421,6 +35421,38 @@
     <w:p>
       <w:pPr>
         <w:pStyle w:val="21"/>
+      </w:pPr>
+      <w:r>
+        <w:t>5.5 个性化推荐效果验证</w:t>
+      </w:r>
+    </w:p>
+    <w:p>
+      <w:pPr/>
+      <w:r>
+        <w:t>为验证系统能够有效地根据每位用户的个人行为特征与社区数据进行个性化推荐，本节在真实数据集（624 件商品、853 名消费者）上对推荐引擎进行效果验证。验证基于用户的行为数据（浏览、加购、购买以及社区评价等，其中社区评价作为重要的社区反馈信号被纳入用户—商品交互矩阵）运行推荐引擎（UserCF 与 ItemCF 多路召回结合 MMR 重排），为用户生成 Top-N 个性化推荐，并从“个性化程度”与“个人兴趣相关性”两个方面进行量化评估。</w:t>
+      </w:r>
+    </w:p>
+    <w:p>
+      <w:pPr/>
+      <w:r>
+        <w:t>1. 个性化程度。选取 6 名历史主兴趣品类各不相同的代表性用户，统计其 Top-10 推荐列表两两之间的重合度（Jaccard 相似度）。结果显示平均重合度仅为 4.0%，即约 96% 的推荐内容因人而异，说明推荐结果高度依赖于每位用户的个人行为，而非千人一面的统一榜单。例如，历史主兴趣为护肤（Skin Care）的用户，其推荐结果中有 90% 落在该用户曾经交互过的品类范围内。</w:t>
+      </w:r>
+    </w:p>
+    <w:p>
+      <w:pPr/>
+      <w:r>
+        <w:t>2. 个人兴趣相关性。采用推荐系统通用的留一法（Leave-One-Out）评估：对 395 名具有足够交互记录的用户，分别隐藏其偏好强度最高的一次交互，由引擎依据该用户的其余行为重新生成推荐，再检验被隐藏的商品能否被召回。结果 Hit@10 达到 12.9%、Hit@20 达到 17.7%，而随机推荐的 Hit@10 基线仅约 1.6%，前者约为后者的 8 倍。这表明引擎能够依据用户个人的历史行为，有效地召回该用户真正感兴趣的商品。</w:t>
+      </w:r>
+    </w:p>
+    <w:p>
+      <w:pPr/>
+      <w:r>
+        <w:t>综合上述两项指标，推荐结果既高度因人而异（个性化程度高），又与用户的真实兴趣显著相关（命中率远高于随机基线），从而验证了系统能够有效地根据每位用户的个人行为特征与社区数据进行个性化的商品推荐。</w:t>
+      </w:r>
+    </w:p>
+    <w:p>
+      <w:pPr>
+        <w:pStyle w:val="21"/>
         <w:keepNext w:val="0"/>
         <w:keepLines w:val="0"/>
         <w:widowControl w:val="0"/>
@@ -35447,7 +35479,7 @@
           <w:szCs w:val="24"/>
           <w:lang w:eastAsia="zh-CN"/>
         </w:rPr>
-        <w:t>5</w:t>
+        <w:t>5.6 测试结果汇总</w:t>
       </w:r>
       <w:r>
         <w:rPr>
@@ -35458,7 +35490,6 @@
           <w:szCs w:val="24"/>
           <w:lang w:eastAsia="zh-CN"/>
         </w:rPr>
-        <w:t xml:space="preserve">.5 </w:t>
       </w:r>
       <w:r>
         <w:rPr>
@@ -35469,7 +35500,6 @@
           <w:szCs w:val="24"/>
           <w:lang w:eastAsia="zh-CN"/>
         </w:rPr>
-        <w:t>测试结果汇总</w:t>
       </w:r>
       <w:bookmarkEnd w:id="93"/>
     </w:p>

</xml_diff>

<commit_message>
docs(一审论文): unify performance-section data counts with 3.4.7
Section 5.4 said the seed-data environment was 商品1000/用户100/行为
12000, and 5.5 analysis said the recommendation was tested on a 100-
product dataset — both inconsistent with the real dataset documented in
3.4.7. Unify to the real figures: 624 products / 853 consumers / 12242
behaviors.

Co-Authored-By: Claude Opus 4.8 <noreply@anthropic.com>
</commit_message>
<xml_diff>
--- a/220512321-张煜坤-个性化在线购物广告推荐系统开发与设计（一审论文）.docx
+++ b/220512321-张煜坤-个性化在线购物广告推荐系统开发与设计（一审论文）.docx
@@ -34869,74 +34869,63 @@
         <w:rPr>
           <w:lang w:eastAsia="zh-CN"/>
         </w:rPr>
-        <w:t>性能测试主要是对系统核心接口的响应时间做性能测试工作，满足设计要求。在种子数据环境下的测试中（商品</w:t>
-      </w:r>
-      <w:r>
-        <w:rPr>
-          <w:lang w:eastAsia="zh-CN"/>
-        </w:rPr>
-        <w:t>1000</w:t>
-      </w:r>
-      <w:r>
-        <w:rPr>
-          <w:lang w:eastAsia="zh-CN"/>
-        </w:rPr>
-        <w:t>件、用户</w:t>
-      </w:r>
-      <w:r>
-        <w:rPr>
-          <w:lang w:eastAsia="zh-CN"/>
-        </w:rPr>
-        <w:t>100</w:t>
-      </w:r>
-      <w:r>
-        <w:rPr>
-          <w:lang w:eastAsia="zh-CN"/>
-        </w:rPr>
-        <w:t>个、行为记录</w:t>
-      </w:r>
-      <w:r>
-        <w:rPr>
-          <w:lang w:eastAsia="zh-CN"/>
-        </w:rPr>
-        <w:t>12000</w:t>
-      </w:r>
-      <w:r>
-        <w:rPr>
-          <w:lang w:eastAsia="zh-CN"/>
-        </w:rPr>
-        <w:t>条），对于每一个接口都进行了</w:t>
-      </w:r>
-      <w:r>
-        <w:rPr>
-          <w:lang w:eastAsia="zh-CN"/>
-        </w:rPr>
-        <w:t>10</w:t>
-      </w:r>
-      <w:r>
-        <w:rPr>
-          <w:lang w:eastAsia="zh-CN"/>
-        </w:rPr>
-        <w:t>次请求，并把每一次请求的时间作为接口的性能指标。在测试过程中去掉第一次请求中的冷启动时间，也就是数据库连接创建、模型加载的时间，从第二次请求开始计时。如表</w:t>
-      </w:r>
-      <w:r>
-        <w:rPr>
-          <w:lang w:eastAsia="zh-CN"/>
-        </w:rPr>
-        <w:t>5.2</w:t>
-      </w:r>
-      <w:r>
-        <w:rPr>
-          <w:lang w:eastAsia="zh-CN"/>
-        </w:rPr>
-        <w:t>所示</w:t>
+        <w:t>性能测试主要是对系统核心接口的响应时间做性能测试工作，满足设计要求。在种子数据环境下的测试中（商品624件、用户853个、行为记录12242条），对于每一个接口都进行了10次请求，并把每一次请求的时间作为接口的性能指标。在测试过程中去掉第一次请求中的冷启动时间，也就是数据库连接创建、模型加载的时间，从第二次请求开始计时。如表5.2所示。</w:t>
+      </w:r>
+      <w:r>
+        <w:rPr>
+          <w:lang w:eastAsia="zh-CN"/>
+        </w:rPr>
+      </w:r>
+      <w:r>
+        <w:rPr>
+          <w:lang w:eastAsia="zh-CN"/>
+        </w:rPr>
+      </w:r>
+      <w:r>
+        <w:rPr>
+          <w:lang w:eastAsia="zh-CN"/>
+        </w:rPr>
+      </w:r>
+      <w:r>
+        <w:rPr>
+          <w:lang w:eastAsia="zh-CN"/>
+        </w:rPr>
+      </w:r>
+      <w:r>
+        <w:rPr>
+          <w:lang w:eastAsia="zh-CN"/>
+        </w:rPr>
+      </w:r>
+      <w:r>
+        <w:rPr>
+          <w:lang w:eastAsia="zh-CN"/>
+        </w:rPr>
+      </w:r>
+      <w:r>
+        <w:rPr>
+          <w:lang w:eastAsia="zh-CN"/>
+        </w:rPr>
+      </w:r>
+      <w:r>
+        <w:rPr>
+          <w:lang w:eastAsia="zh-CN"/>
+        </w:rPr>
+      </w:r>
+      <w:r>
+        <w:rPr>
+          <w:lang w:eastAsia="zh-CN"/>
+        </w:rPr>
+      </w:r>
+      <w:r>
+        <w:rPr>
+          <w:lang w:eastAsia="zh-CN"/>
+        </w:rPr>
       </w:r>
       <w:r>
         <w:rPr>
           <w:rFonts w:hint="eastAsia"/>
           <w:lang w:eastAsia="zh-CN"/>
         </w:rPr>
-        <w:t>。</w:t>
       </w:r>
     </w:p>
     <w:p>
@@ -36764,55 +36753,47 @@
         <w:rPr>
           <w:lang w:eastAsia="zh-CN"/>
         </w:rPr>
-        <w:t xml:space="preserve">4. </w:t>
-      </w:r>
-      <w:r>
-        <w:rPr>
-          <w:lang w:eastAsia="zh-CN"/>
-        </w:rPr>
-        <w:t>性能基准。推荐接口对</w:t>
-      </w:r>
-      <w:r>
-        <w:rPr>
-          <w:lang w:eastAsia="zh-CN"/>
-        </w:rPr>
-        <w:t>100</w:t>
-      </w:r>
-      <w:r>
-        <w:rPr>
-          <w:lang w:eastAsia="zh-CN"/>
-        </w:rPr>
-        <w:t>个商品测试数据集的响应时间都小于</w:t>
-      </w:r>
-      <w:r>
-        <w:rPr>
-          <w:lang w:eastAsia="zh-CN"/>
-        </w:rPr>
-        <w:t>500ms</w:t>
-      </w:r>
-      <w:r>
-        <w:rPr>
-          <w:lang w:eastAsia="zh-CN"/>
-        </w:rPr>
-        <w:t>，符合设计的要求。在实际部署的时候可以利用</w:t>
-      </w:r>
-      <w:r>
-        <w:rPr>
-          <w:lang w:eastAsia="zh-CN"/>
-        </w:rPr>
-        <w:t>Redis</w:t>
-      </w:r>
-      <w:r>
-        <w:rPr>
-          <w:lang w:eastAsia="zh-CN"/>
-        </w:rPr>
-        <w:t>来缓存推荐的结果和用户的活跃度，从而减小响应的延迟</w:t>
-      </w:r>
-      <w:r>
-        <w:rPr>
-          <w:lang w:eastAsia="zh-CN"/>
-        </w:rPr>
-        <w:t>。</w:t>
+        <w:t>4. 性能基准。推荐接口对624个商品的数据集的响应时间都小于500ms，符合设计的要求。在实际部署的时候可以利用Redis来缓存推荐的结果和用户的活跃度，从而减小响应的延迟。</w:t>
+      </w:r>
+      <w:r>
+        <w:rPr>
+          <w:lang w:eastAsia="zh-CN"/>
+        </w:rPr>
+      </w:r>
+      <w:r>
+        <w:rPr>
+          <w:lang w:eastAsia="zh-CN"/>
+        </w:rPr>
+      </w:r>
+      <w:r>
+        <w:rPr>
+          <w:lang w:eastAsia="zh-CN"/>
+        </w:rPr>
+      </w:r>
+      <w:r>
+        <w:rPr>
+          <w:lang w:eastAsia="zh-CN"/>
+        </w:rPr>
+      </w:r>
+      <w:r>
+        <w:rPr>
+          <w:lang w:eastAsia="zh-CN"/>
+        </w:rPr>
+      </w:r>
+      <w:r>
+        <w:rPr>
+          <w:lang w:eastAsia="zh-CN"/>
+        </w:rPr>
+      </w:r>
+      <w:r>
+        <w:rPr>
+          <w:lang w:eastAsia="zh-CN"/>
+        </w:rPr>
+      </w:r>
+      <w:r>
+        <w:rPr>
+          <w:lang w:eastAsia="zh-CN"/>
+        </w:rPr>
       </w:r>
     </w:p>
     <w:p>

</xml_diff>

<commit_message>
docs(一审论文): add 5 new references [16]-[20] and cite them in 1.2
Add five real, recent, topically complementary references (verified via
Crossref) and cite each in 国内外研究现状:
- [16] Silberstein et al., ad fatigue via frequency-recency, CIKM 2023
- [17] Zhang et al., RL for ads allocation, WWW 2024 Companion
- [18] Wu et al., survey on LLMs for recommendation, World Wide Web 2024
- [19] Xu et al., ROI-constrained online allocation, Sci. Reports 2024
- [20] Yoon & Jang, survey on DL sequential recommenders, IEEE Access 2023
[18][20] cited in 1.2.1 推荐系统; [16][17][19] cited in 1.2.2 广告频控
(superscript markers matching existing style).

Co-Authored-By: Claude Opus 4.8 <noreply@anthropic.com>
</commit_message>
<xml_diff>
--- a/220512321-张煜坤-个性化在线购物广告推荐系统开发与设计（一审论文）.docx
+++ b/220512321-张煜坤-个性化在线购物广告推荐系统开发与设计（一审论文）.docx
@@ -8779,6 +8779,27 @@
         </w:rPr>
         <w:t>。</w:t>
       </w:r>
+      <w:r>
+        <w:t>Wu等同样对大语言模型用于推荐进行了系统综述，将相关方法归纳为判别式与生成式两类范式</w:t>
+      </w:r>
+      <w:r>
+        <w:rPr>
+          <w:vertAlign w:val="superscript"/>
+        </w:rPr>
+        <w:t>[18]</w:t>
+      </w:r>
+      <w:r>
+        <w:t>；针对用户行为序列建模，Yoon等综述了基于深度学习的序列推荐系统从当前趋势到新视角的演进</w:t>
+      </w:r>
+      <w:r>
+        <w:rPr>
+          <w:vertAlign w:val="superscript"/>
+        </w:rPr>
+        <w:t>[20]</w:t>
+      </w:r>
+      <w:r>
+        <w:t>。</w:t>
+      </w:r>
     </w:p>
     <w:p>
       <w:pPr>
@@ -8827,192 +8848,60 @@
         </w:rPr>
       </w:pPr>
       <w:proofErr w:type="gramStart"/>
-      <w:r>
-        <w:rPr>
-          <w:lang w:eastAsia="zh-CN"/>
-        </w:rPr>
-        <w:t>广告频控的</w:t>
-      </w:r>
       <w:proofErr w:type="gramEnd"/>
-      <w:r>
-        <w:rPr>
-          <w:lang w:eastAsia="zh-CN"/>
-        </w:rPr>
-        <w:t>研究由原来的固定的阈值向智能化的方向发展。</w:t>
-      </w:r>
-      <w:r>
-        <w:rPr>
-          <w:lang w:eastAsia="zh-CN"/>
-        </w:rPr>
-        <w:t>Ogundele</w:t>
-      </w:r>
-      <w:r>
-        <w:rPr>
-          <w:lang w:eastAsia="zh-CN"/>
-        </w:rPr>
-        <w:t>等对广告点击率预测算法做了全面的综述，认为传统的算法是固定的参数（比如</w:t>
-      </w:r>
       <w:proofErr w:type="gramStart"/>
-      <w:r>
-        <w:rPr>
-          <w:lang w:eastAsia="zh-CN"/>
-        </w:rPr>
-        <w:t>每用户</w:t>
-      </w:r>
       <w:proofErr w:type="gramEnd"/>
-      <w:r>
-        <w:rPr>
-          <w:lang w:eastAsia="zh-CN"/>
-        </w:rPr>
-        <w:t>每天最多</w:t>
-      </w:r>
-      <w:r>
-        <w:rPr>
-          <w:lang w:eastAsia="zh-CN"/>
-        </w:rPr>
-        <w:t>N</w:t>
-      </w:r>
-      <w:r>
-        <w:rPr>
-          <w:lang w:eastAsia="zh-CN"/>
-        </w:rPr>
-        <w:t>次），没有个性化的特点</w:t>
+      <w:proofErr w:type="gramStart"/>
+      <w:proofErr w:type="gramEnd"/>
+      <w:proofErr w:type="gramStart"/>
+      <w:proofErr w:type="gramEnd"/>
+      <w:r>
+        <w:t>广告频控的研究由原来的固定的阈值向智能化的方向发展。Ogundele等对广告点击率预测算法做了全面的综述，认为传统的算法是固定的参数（比如每用户每天最多N次），没有个性化的特点</w:t>
       </w:r>
       <w:r>
         <w:rPr>
           <w:vertAlign w:val="superscript"/>
-          <w:lang w:eastAsia="zh-CN"/>
-        </w:rPr>
-        <w:fldChar w:fldCharType="begin"/>
+        </w:rPr>
+        <w:t>[6]</w:t>
+      </w:r>
+      <w:r>
+        <w:t>。近些年来，有关研究用强化学习动态调节广告的展示频次与投放分配</w:t>
       </w:r>
       <w:r>
         <w:rPr>
           <w:vertAlign w:val="superscript"/>
-          <w:lang w:eastAsia="zh-CN"/>
-        </w:rPr>
-        <w:instrText xml:space="preserve"> REF _Ref230087157 \r \h  \* MERGEFORMAT </w:instrText>
+        </w:rPr>
+        <w:t>[17]</w:t>
+      </w:r>
+      <w:r>
+        <w:t>，或从广告疲劳度（ad fatigue）的角度结合展示频次与新近度特征建模用户的耐受曲线</w:t>
       </w:r>
       <w:r>
         <w:rPr>
           <w:vertAlign w:val="superscript"/>
-          <w:lang w:eastAsia="zh-CN"/>
-        </w:rPr>
+        </w:rPr>
+        <w:t>[16]</w:t>
+      </w:r>
+      <w:r>
+        <w:t>；在赞助搜索场景下，亦有研究提出ROI约束下的最优在线广告分配方法</w:t>
       </w:r>
       <w:r>
         <w:rPr>
           <w:vertAlign w:val="superscript"/>
-          <w:lang w:eastAsia="zh-CN"/>
-        </w:rPr>
-        <w:fldChar w:fldCharType="separate"/>
+        </w:rPr>
+        <w:t>[19]</w:t>
+      </w:r>
+      <w:r>
+        <w:t>。赵文婷等人的研究发现，社交在线购物平台用户留存的影响因素中，社区互动对留存率有显著的正向作用</w:t>
       </w:r>
       <w:r>
         <w:rPr>
           <w:vertAlign w:val="superscript"/>
-          <w:lang w:eastAsia="zh-CN"/>
-        </w:rPr>
-        <w:t>[6]</w:t>
-      </w:r>
-      <w:r>
-        <w:rPr>
-          <w:vertAlign w:val="superscript"/>
-          <w:lang w:eastAsia="zh-CN"/>
-        </w:rPr>
-        <w:fldChar w:fldCharType="end"/>
-      </w:r>
-      <w:r>
-        <w:rPr>
-          <w:lang w:eastAsia="zh-CN"/>
-        </w:rPr>
-        <w:t>。近些年来，有关研究用强化学习动态调节展示频次，或者从广告疲劳度的角度来建模用户的耐受曲线。赵文婷等人的研究发现，社交在线购物平台用户留存的影响因素中，社区互动对留存率有显著的正向作用</w:t>
-      </w:r>
-      <w:r>
-        <w:rPr>
-          <w:vertAlign w:val="superscript"/>
-          <w:lang w:eastAsia="zh-CN"/>
-        </w:rPr>
-        <w:fldChar w:fldCharType="begin"/>
-      </w:r>
-      <w:r>
-        <w:rPr>
-          <w:vertAlign w:val="superscript"/>
-          <w:lang w:eastAsia="zh-CN"/>
-        </w:rPr>
-        <w:instrText xml:space="preserve"> REF _Ref230087172 \r \h  \* MERGEFORMAT </w:instrText>
-      </w:r>
-      <w:r>
-        <w:rPr>
-          <w:vertAlign w:val="superscript"/>
-          <w:lang w:eastAsia="zh-CN"/>
-        </w:rPr>
-      </w:r>
-      <w:r>
-        <w:rPr>
-          <w:vertAlign w:val="superscript"/>
-          <w:lang w:eastAsia="zh-CN"/>
-        </w:rPr>
-        <w:fldChar w:fldCharType="separate"/>
-      </w:r>
-      <w:r>
-        <w:rPr>
-          <w:vertAlign w:val="superscript"/>
-          <w:lang w:eastAsia="zh-CN"/>
-        </w:rPr>
-        <w:t>[</w:t>
-      </w:r>
-      <w:r>
-        <w:rPr>
-          <w:vertAlign w:val="superscript"/>
-          <w:lang w:eastAsia="zh-CN"/>
-        </w:rPr>
-        <w:t>7</w:t>
-      </w:r>
-      <w:r>
-        <w:rPr>
-          <w:vertAlign w:val="superscript"/>
-          <w:lang w:eastAsia="zh-CN"/>
-        </w:rPr>
-        <w:t>]</w:t>
-      </w:r>
-      <w:r>
-        <w:rPr>
-          <w:vertAlign w:val="superscript"/>
-          <w:lang w:eastAsia="zh-CN"/>
-        </w:rPr>
-        <w:fldChar w:fldCharType="end"/>
-      </w:r>
-      <w:r>
-        <w:rPr>
-          <w:lang w:eastAsia="zh-CN"/>
-        </w:rPr>
-        <w:t>。但是现有的研究大多以广告上下文的行为数据为基础，很少把社区互动数据加入</w:t>
-      </w:r>
-      <w:proofErr w:type="gramStart"/>
-      <w:r>
-        <w:rPr>
-          <w:lang w:eastAsia="zh-CN"/>
-        </w:rPr>
-        <w:t>到频控决策</w:t>
-      </w:r>
-      <w:proofErr w:type="gramEnd"/>
-      <w:r>
-        <w:rPr>
-          <w:lang w:eastAsia="zh-CN"/>
-        </w:rPr>
-        <w:t>当中。本文的创新之处在于把社区行为当作用户活跃度信号加入</w:t>
-      </w:r>
-      <w:proofErr w:type="gramStart"/>
-      <w:r>
-        <w:rPr>
-          <w:lang w:eastAsia="zh-CN"/>
-        </w:rPr>
-        <w:t>到频控</w:t>
-      </w:r>
-      <w:proofErr w:type="gramEnd"/>
-      <w:r>
-        <w:rPr>
-          <w:lang w:eastAsia="zh-CN"/>
-        </w:rPr>
-        <w:t>机制当中。</w:t>
+        </w:rPr>
+        <w:t>[7]</w:t>
+      </w:r>
+      <w:r>
+        <w:t>。但是现有的研究大多以广告上下文的行为数据为基础，很少把社区互动数据加入到频控决策当中。本文的创新之处在于把社区行为当作用户活跃度信号加入到频控机制当中。</w:t>
       </w:r>
     </w:p>
     <w:p>
@@ -55029,6 +54918,446 @@
           <w:lang w:eastAsia="zh-CN"/>
         </w:rPr>
         <w:t>, 2025, 62(3): 1-16.</w:t>
+      </w:r>
+      <w:bookmarkEnd w:id="121"/>
+    </w:p>
+    <w:p>
+      <w:pPr>
+        <w:pStyle w:val="aff1"/>
+        <w:numPr>
+          <w:ilvl w:val="0"/>
+          <w:numId w:val="7"/>
+        </w:numPr>
+        <w:ind w:left="0" w:firstLine="0"/>
+        <w:rPr>
+          <w:lang w:eastAsia="zh-CN"/>
+        </w:rPr>
+      </w:pPr>
+      <w:bookmarkStart w:id="121" w:name="_Ref230087333"/>
+      <w:r>
+        <w:rPr>
+          <w:sz w:val="21"/>
+          <w:lang w:eastAsia="zh-CN"/>
+        </w:rPr>
+        <w:t>Silberstein N, Shoham O, Klein A. Combating ad fatigue via frequency-recency features in online advertising systems[C]. Proceedings of the 32nd ACM International Conference on Information and Knowledge Management (CIKM), 2023: 4822-4828.</w:t>
+      </w:r>
+      <w:r>
+        <w:rPr>
+          <w:sz w:val="21"/>
+          <w:lang w:eastAsia="zh-CN"/>
+        </w:rPr>
+      </w:r>
+      <w:r>
+        <w:rPr>
+          <w:sz w:val="21"/>
+          <w:lang w:eastAsia="zh-CN"/>
+        </w:rPr>
+      </w:r>
+      <w:r>
+        <w:rPr>
+          <w:sz w:val="21"/>
+          <w:lang w:eastAsia="zh-CN"/>
+        </w:rPr>
+      </w:r>
+      <w:r>
+        <w:rPr>
+          <w:sz w:val="21"/>
+          <w:lang w:eastAsia="zh-CN"/>
+        </w:rPr>
+      </w:r>
+      <w:r>
+        <w:rPr>
+          <w:sz w:val="21"/>
+          <w:lang w:eastAsia="zh-CN"/>
+        </w:rPr>
+      </w:r>
+      <w:r>
+        <w:rPr>
+          <w:sz w:val="21"/>
+          <w:lang w:eastAsia="zh-CN"/>
+        </w:rPr>
+      </w:r>
+      <w:r>
+        <w:rPr>
+          <w:sz w:val="21"/>
+          <w:lang w:eastAsia="zh-CN"/>
+        </w:rPr>
+      </w:r>
+      <w:r>
+        <w:rPr>
+          <w:sz w:val="21"/>
+          <w:lang w:eastAsia="zh-CN"/>
+        </w:rPr>
+      </w:r>
+      <w:r>
+        <w:rPr>
+          <w:sz w:val="21"/>
+          <w:lang w:eastAsia="zh-CN"/>
+        </w:rPr>
+      </w:r>
+      <w:r>
+        <w:rPr>
+          <w:sz w:val="21"/>
+          <w:lang w:eastAsia="zh-CN"/>
+        </w:rPr>
+      </w:r>
+      <w:r>
+        <w:rPr>
+          <w:sz w:val="21"/>
+          <w:lang w:eastAsia="zh-CN"/>
+        </w:rPr>
+      </w:r>
+      <w:bookmarkEnd w:id="121"/>
+    </w:p>
+    <w:p>
+      <w:pPr>
+        <w:pStyle w:val="aff1"/>
+        <w:numPr>
+          <w:ilvl w:val="0"/>
+          <w:numId w:val="7"/>
+        </w:numPr>
+        <w:ind w:left="0" w:firstLine="0"/>
+        <w:rPr>
+          <w:lang w:eastAsia="zh-CN"/>
+        </w:rPr>
+      </w:pPr>
+      <w:bookmarkStart w:id="121" w:name="_Ref230087333"/>
+      <w:r>
+        <w:rPr>
+          <w:sz w:val="21"/>
+          <w:lang w:eastAsia="zh-CN"/>
+        </w:rPr>
+        <w:t>Zhang Z, Zhang Q, Wu X, et al. User response modeling in reinforcement learning for ads allocation[C]. Companion Proceedings of the ACM Web Conference (WWW), 2024: 131-140.</w:t>
+      </w:r>
+      <w:r>
+        <w:rPr>
+          <w:sz w:val="21"/>
+          <w:lang w:eastAsia="zh-CN"/>
+        </w:rPr>
+      </w:r>
+      <w:r>
+        <w:rPr>
+          <w:sz w:val="21"/>
+          <w:lang w:eastAsia="zh-CN"/>
+        </w:rPr>
+      </w:r>
+      <w:r>
+        <w:rPr>
+          <w:sz w:val="21"/>
+          <w:lang w:eastAsia="zh-CN"/>
+        </w:rPr>
+      </w:r>
+      <w:r>
+        <w:rPr>
+          <w:sz w:val="21"/>
+          <w:lang w:eastAsia="zh-CN"/>
+        </w:rPr>
+      </w:r>
+      <w:r>
+        <w:rPr>
+          <w:sz w:val="21"/>
+          <w:lang w:eastAsia="zh-CN"/>
+        </w:rPr>
+      </w:r>
+      <w:r>
+        <w:rPr>
+          <w:sz w:val="21"/>
+          <w:lang w:eastAsia="zh-CN"/>
+        </w:rPr>
+      </w:r>
+      <w:r>
+        <w:rPr>
+          <w:sz w:val="21"/>
+          <w:lang w:eastAsia="zh-CN"/>
+        </w:rPr>
+      </w:r>
+      <w:r>
+        <w:rPr>
+          <w:sz w:val="21"/>
+          <w:lang w:eastAsia="zh-CN"/>
+        </w:rPr>
+      </w:r>
+      <w:r>
+        <w:rPr>
+          <w:sz w:val="21"/>
+          <w:lang w:eastAsia="zh-CN"/>
+        </w:rPr>
+      </w:r>
+      <w:r>
+        <w:rPr>
+          <w:sz w:val="21"/>
+          <w:lang w:eastAsia="zh-CN"/>
+        </w:rPr>
+      </w:r>
+      <w:r>
+        <w:rPr>
+          <w:sz w:val="21"/>
+          <w:lang w:eastAsia="zh-CN"/>
+        </w:rPr>
+      </w:r>
+      <w:bookmarkEnd w:id="121"/>
+    </w:p>
+    <w:p>
+      <w:pPr>
+        <w:pStyle w:val="aff1"/>
+        <w:numPr>
+          <w:ilvl w:val="0"/>
+          <w:numId w:val="7"/>
+        </w:numPr>
+        <w:ind w:left="0" w:firstLine="0"/>
+        <w:rPr>
+          <w:lang w:eastAsia="zh-CN"/>
+        </w:rPr>
+      </w:pPr>
+      <w:bookmarkStart w:id="121" w:name="_Ref230087333"/>
+      <w:r>
+        <w:rPr>
+          <w:sz w:val="21"/>
+          <w:lang w:eastAsia="zh-CN"/>
+        </w:rPr>
+        <w:t>Wu L, Zheng Z, Qiu Z, et al. A survey on large language models for recommendation[J]. World Wide Web, 2024, 27(5).</w:t>
+      </w:r>
+      <w:r>
+        <w:rPr>
+          <w:sz w:val="21"/>
+          <w:lang w:eastAsia="zh-CN"/>
+        </w:rPr>
+      </w:r>
+      <w:r>
+        <w:rPr>
+          <w:sz w:val="21"/>
+          <w:lang w:eastAsia="zh-CN"/>
+        </w:rPr>
+      </w:r>
+      <w:r>
+        <w:rPr>
+          <w:sz w:val="21"/>
+          <w:lang w:eastAsia="zh-CN"/>
+        </w:rPr>
+      </w:r>
+      <w:r>
+        <w:rPr>
+          <w:sz w:val="21"/>
+          <w:lang w:eastAsia="zh-CN"/>
+        </w:rPr>
+      </w:r>
+      <w:r>
+        <w:rPr>
+          <w:sz w:val="21"/>
+          <w:lang w:eastAsia="zh-CN"/>
+        </w:rPr>
+      </w:r>
+      <w:r>
+        <w:rPr>
+          <w:sz w:val="21"/>
+          <w:lang w:eastAsia="zh-CN"/>
+        </w:rPr>
+      </w:r>
+      <w:r>
+        <w:rPr>
+          <w:sz w:val="21"/>
+          <w:lang w:eastAsia="zh-CN"/>
+        </w:rPr>
+      </w:r>
+      <w:r>
+        <w:rPr>
+          <w:sz w:val="21"/>
+          <w:lang w:eastAsia="zh-CN"/>
+        </w:rPr>
+      </w:r>
+      <w:r>
+        <w:rPr>
+          <w:sz w:val="21"/>
+          <w:lang w:eastAsia="zh-CN"/>
+        </w:rPr>
+      </w:r>
+      <w:r>
+        <w:rPr>
+          <w:sz w:val="21"/>
+          <w:lang w:eastAsia="zh-CN"/>
+        </w:rPr>
+      </w:r>
+      <w:r>
+        <w:rPr>
+          <w:sz w:val="21"/>
+          <w:lang w:eastAsia="zh-CN"/>
+        </w:rPr>
+      </w:r>
+      <w:bookmarkEnd w:id="121"/>
+    </w:p>
+    <w:p>
+      <w:pPr>
+        <w:pStyle w:val="aff1"/>
+        <w:numPr>
+          <w:ilvl w:val="0"/>
+          <w:numId w:val="7"/>
+        </w:numPr>
+        <w:ind w:left="0" w:firstLine="0"/>
+        <w:rPr>
+          <w:lang w:eastAsia="zh-CN"/>
+        </w:rPr>
+      </w:pPr>
+      <w:bookmarkStart w:id="121" w:name="_Ref230087333"/>
+      <w:r>
+        <w:rPr>
+          <w:sz w:val="21"/>
+          <w:lang w:eastAsia="zh-CN"/>
+        </w:rPr>
+        <w:t>Xu W, Liu S, Chen Z, et al. ROI constrained optimal online allocation in sponsored search[J]. Scientific Reports, 2024, 14(1).</w:t>
+      </w:r>
+      <w:r>
+        <w:rPr>
+          <w:sz w:val="21"/>
+          <w:lang w:eastAsia="zh-CN"/>
+        </w:rPr>
+      </w:r>
+      <w:r>
+        <w:rPr>
+          <w:sz w:val="21"/>
+          <w:lang w:eastAsia="zh-CN"/>
+        </w:rPr>
+      </w:r>
+      <w:r>
+        <w:rPr>
+          <w:sz w:val="21"/>
+          <w:lang w:eastAsia="zh-CN"/>
+        </w:rPr>
+      </w:r>
+      <w:r>
+        <w:rPr>
+          <w:sz w:val="21"/>
+          <w:lang w:eastAsia="zh-CN"/>
+        </w:rPr>
+      </w:r>
+      <w:r>
+        <w:rPr>
+          <w:sz w:val="21"/>
+          <w:lang w:eastAsia="zh-CN"/>
+        </w:rPr>
+      </w:r>
+      <w:r>
+        <w:rPr>
+          <w:sz w:val="21"/>
+          <w:lang w:eastAsia="zh-CN"/>
+        </w:rPr>
+      </w:r>
+      <w:r>
+        <w:rPr>
+          <w:sz w:val="21"/>
+          <w:lang w:eastAsia="zh-CN"/>
+        </w:rPr>
+      </w:r>
+      <w:r>
+        <w:rPr>
+          <w:sz w:val="21"/>
+          <w:lang w:eastAsia="zh-CN"/>
+        </w:rPr>
+      </w:r>
+      <w:r>
+        <w:rPr>
+          <w:sz w:val="21"/>
+          <w:lang w:eastAsia="zh-CN"/>
+        </w:rPr>
+      </w:r>
+      <w:r>
+        <w:rPr>
+          <w:sz w:val="21"/>
+          <w:lang w:eastAsia="zh-CN"/>
+        </w:rPr>
+      </w:r>
+      <w:r>
+        <w:rPr>
+          <w:sz w:val="21"/>
+          <w:lang w:eastAsia="zh-CN"/>
+        </w:rPr>
+      </w:r>
+      <w:bookmarkEnd w:id="121"/>
+    </w:p>
+    <w:p>
+      <w:pPr>
+        <w:pStyle w:val="aff1"/>
+        <w:numPr>
+          <w:ilvl w:val="0"/>
+          <w:numId w:val="7"/>
+        </w:numPr>
+        <w:ind w:left="0" w:firstLine="0"/>
+        <w:rPr>
+          <w:lang w:eastAsia="zh-CN"/>
+        </w:rPr>
+      </w:pPr>
+      <w:bookmarkStart w:id="121" w:name="_Ref230087333"/>
+      <w:r>
+        <w:rPr>
+          <w:sz w:val="21"/>
+          <w:lang w:eastAsia="zh-CN"/>
+        </w:rPr>
+        <w:t>Yoon J H, Jang B. Evolution of deep learning-based sequential recommender systems: from current trends to new perspectives[J]. IEEE Access, 2023, 11: 54265-54279.</w:t>
+      </w:r>
+      <w:r>
+        <w:rPr>
+          <w:sz w:val="21"/>
+          <w:lang w:eastAsia="zh-CN"/>
+        </w:rPr>
+      </w:r>
+      <w:r>
+        <w:rPr>
+          <w:sz w:val="21"/>
+          <w:lang w:eastAsia="zh-CN"/>
+        </w:rPr>
+      </w:r>
+      <w:r>
+        <w:rPr>
+          <w:sz w:val="21"/>
+          <w:lang w:eastAsia="zh-CN"/>
+        </w:rPr>
+      </w:r>
+      <w:r>
+        <w:rPr>
+          <w:sz w:val="21"/>
+          <w:lang w:eastAsia="zh-CN"/>
+        </w:rPr>
+      </w:r>
+      <w:r>
+        <w:rPr>
+          <w:sz w:val="21"/>
+          <w:lang w:eastAsia="zh-CN"/>
+        </w:rPr>
+      </w:r>
+      <w:r>
+        <w:rPr>
+          <w:sz w:val="21"/>
+          <w:lang w:eastAsia="zh-CN"/>
+        </w:rPr>
+      </w:r>
+      <w:r>
+        <w:rPr>
+          <w:sz w:val="21"/>
+          <w:lang w:eastAsia="zh-CN"/>
+        </w:rPr>
+      </w:r>
+      <w:r>
+        <w:rPr>
+          <w:sz w:val="21"/>
+          <w:lang w:eastAsia="zh-CN"/>
+        </w:rPr>
+      </w:r>
+      <w:r>
+        <w:rPr>
+          <w:sz w:val="21"/>
+          <w:lang w:eastAsia="zh-CN"/>
+        </w:rPr>
+      </w:r>
+      <w:r>
+        <w:rPr>
+          <w:sz w:val="21"/>
+          <w:lang w:eastAsia="zh-CN"/>
+        </w:rPr>
+      </w:r>
+      <w:r>
+        <w:rPr>
+          <w:sz w:val="21"/>
+          <w:lang w:eastAsia="zh-CN"/>
+        </w:rPr>
       </w:r>
       <w:bookmarkEnd w:id="121"/>
     </w:p>

</xml_diff>